<commit_message>
Use original CCS C5509 workflow with embedded fixed photo and local MATLAB scripts
</commit_message>
<xml_diff>
--- a/论文.docx
+++ b/论文.docx
@@ -2,7 +2,7 @@
 <file path=word/document.xml><?xml version="1.0" encoding="utf-8"?>
 <w:document xmlns:w="http://schemas.openxmlformats.org/wordprocessingml/2006/main" xmlns:m="http://schemas.openxmlformats.org/officeDocument/2006/math" xmlns:r="http://schemas.openxmlformats.org/officeDocument/2006/relationships" xmlns:o="urn:schemas-microsoft-com:office:office" xmlns:v="urn:schemas-microsoft-com:vml" xmlns:w10="urn:schemas-microsoft-com:office:word" xmlns:a="http://schemas.openxmlformats.org/drawingml/2006/main" xmlns:pic="http://schemas.openxmlformats.org/drawingml/2006/picture" xmlns:wp="http://schemas.openxmlformats.org/drawingml/2006/wordprocessingDrawing">
   <w:body>
-    <w:bookmarkStart w:id="68" w:name="基于-c5509-原工程的可切换数字滤波fft-与-amdsb-演示系统设计"/>
+    <w:bookmarkStart w:id="69" w:name="基于原-c5509-实验系统的固定图像滤波fft-与-amdsb-设计"/>
     <w:p>
       <w:pPr>
         <w:pStyle w:val="Title"/>
@@ -12,7 +12,7 @@
         <w:rPr>
           <w:sz w:val="40"/>
         </w:rPr>
-        <w:t xml:space="preserve">基于 C5509 原工程的可切换数字滤波、FFT 与 AM/DSB 演示系统设计</w:t>
+        <w:t xml:space="preserve">基于原 C5509 实验系统的固定图像滤波、FFT 与 AM/DSB 设计</w:t>
       </w:r>
     </w:p>
     <w:p>
@@ -57,7 +57,7 @@
         <w:ind w:firstLine="480"/>
       </w:pPr>
       <w:r>
-        <w:t xml:space="preserve">版本说明：本稿依据所提供的评分标准与课设要求编写，采用通用课程报告版式；未提供的学校专用封面需另行套用。算法验证已经执行，目标编译、真实板卡与 FLASH 实验留有待填写记录，不将仿真结果冒充实测。</w:t>
+        <w:t xml:space="preserve">版本说明：依据课设要求及原 DSP 实验记录编写。平台为原 ICETEK-VC5509-A、C5509A XDS510 Emulator 与 CCS 3.3；新增算法结果来自服务器执行的 C 程序和 .m 脚本，尚待原实验箱复核。</w:t>
       </w:r>
     </w:p>
     <w:bookmarkStart w:id="20" w:name="摘要"/>
@@ -76,16 +76,16 @@
         <w:ind w:firstLine="480"/>
       </w:pPr>
       <w:r>
-        <w:t xml:space="preserve">针对数字系统综合设计中滤波器、快速傅里叶变换与幅度调制的综合训练需求，设计了基于既有 C5509 教学工程的软件系统。系统保留原有时钟、外存初始化及矩阵按键读取路径，使用数字按键选择低通、带通、带阻、两种 FFT 后端以及 AM、DSB 调制，并以图像缓冲区和数值信号缓冲区展示结果。滤波模块采用采样率 32 kHz、257 抽头 Kaiser 窗 FIR 结构，提供 28 组 Q15 系数，覆盖 1—10 kHz 的截止频率及相邻带通、带阻频带。FFT 模块采用 256 点基二算法，分别实现 DIT 与 DIF 描述，逐级缩放并对特殊旋转因子作精确处理；DIF 后端提供生成 C55x 汇编后再汇编链接的构建流程。调制模块使用 1 kHz 消息与 8 kHz 载波，比较载波存在与抑制情况下的频谱差异。主机端以相同便携 C 源码执行独立参考验证，61 项检查全部通过，全部滤波器的最差阻带衰减约为 57.57 dB，最大通带波动约为 0.0196 dB。设计同时给出图片转换、CCS 内存导入导出、虚拟机使用及 Matlab 仿真步骤，为后续实际板卡联调提供可复现基础。</w:t>
-      </w:r>
-    </w:p>
-    <w:p>
-      <w:pPr>
-        <w:pStyle w:val="BodyText"/>
-        <w:ind w:firstLine="480"/>
-      </w:pPr>
-      <w:r>
-        <w:t xml:space="preserve">关键词：C5509；FIR 滤波器；定点 FFT；AM；DSB；图像显示</w:t>
+        <w:t xml:space="preserve">为满足数字系统综合设计中数字滤波、快速傅里叶变换和幅度调制的训练要求，在既有 ICETEK-VC5509-A 实验程序上设计固定图像处理系统。原实验记录确认开发环境为 C5509A XDS510 Emulator 与 CCS 3.3，因此保留原 PLL、SDRAM、CTR 初始化及按键读取路径，不增加虚拟机主机模拟器。选用 NASA 公有领域宇航员照片，转换为 80×80 灰度图并内嵌为 C 常量；程序下载后即可按键处理，无需目标端文件读取或电脑图片导入。系统实现 257 抽头 Q15 低通、带通和带阻 FIR，提供覆盖 1—10 kHz 边缘的 28 组系数；实现 256 点 DIT 与 DIF FFT 描述，以及 AM、DSB 调制。结果仍通过原 dbImage、dbTargetImage 缓冲区在 CCS Image 中观察，并增加供 Graph 使用的行数据和幅度数组。服务器实际执行同一套便携 C 源码，通过 122 项检查；同一份 Matlab 兼容 .m 脚本在 GNU Octave 9.4.0 中运行，七种图像输出与 C 结果逐像素一致，生成 41 张图。量化后滤波器最差阻带衰减约为 57.57 dB，最大通带波动约为 0.0196 dB。仿真脚本供本机 MATLAB 复现，虚拟机仅承担原 CCS 编译、下载、按键和显示任务。</w:t>
+      </w:r>
+    </w:p>
+    <w:p>
+      <w:pPr>
+        <w:pStyle w:val="BodyText"/>
+        <w:ind w:firstLine="480"/>
+      </w:pPr>
+      <w:r>
+        <w:t xml:space="preserve">关键词：C5509；固定图像；FIR；FFT；AM；DSB；CCS</w:t>
       </w:r>
     </w:p>
     <w:bookmarkEnd w:id="20"/>
@@ -105,16 +105,16 @@
         <w:ind w:firstLine="480"/>
       </w:pPr>
       <w:r>
-        <w:t xml:space="preserve">A configurable digital signal processing demonstration system is developed from an existing C5509 educational project. The original clock, memory initialization and keypad interfaces are retained. Numeric keys select low-pass, band-pass and band-reject FIR filtering, two FFT backends, and AM or suppressed-carrier DSB modulation. Twenty-eight banks of 257-tap Q15 coefficients are designed at a sampling frequency of 32 kHz. Independent radix-2 DIT and DIF formulations provide normalized 256-point transforms, with stage scaling and exact handling of unity and quadrature twiddle factors. The DIF source can be translated into C55x assembly and assembled again through the supplied target build procedure. Modulation experiments use a 1 kHz message and an 8 kHz carrier. Native execution of the portable C sources passes 61 final checks against independent numerical references. The worst stopband attenuation of the quantized filter banks is approximately 57.57 dB, and the maximum passband ripple is approximately 0.0196 dB. Image conversion, debugger-based memory exchange, virtual-machine operation and MATLAB simulation scripts are included. Native algorithm validation is distinguished from target compilation and physical-board experiments, which require the actual hardware and toolchain.</w:t>
-      </w:r>
-    </w:p>
-    <w:p>
-      <w:pPr>
-        <w:pStyle w:val="BodyText"/>
-        <w:ind w:firstLine="480"/>
-      </w:pPr>
-      <w:r>
-        <w:t xml:space="preserve">Keywords: C5509; FIR filter; fixed-point FFT; AM; DSB; image visualization</w:t>
+        <w:t xml:space="preserve">A fixed-image processing system is developed from an existing ICETEK-VC5509-A educational project. The original experiment record confirms CCS 3.3 and a C5509A XDS510 emulator. The original clock, SDRAM, control-board initialization and keypad interfaces are retained. A public-domain NASA photograph is converted into an 80-by-80 grayscale image and embedded in the program, eliminating target file access and manual image import. Numeric keys select low-pass, band-pass and band-reject FIR filtering, two radix-2 FFT formulations, and AM or suppressed-carrier DSB modulation. Twenty-eight banks of 257-tap Q15 coefficients are designed at a sampling frequency of 32 kHz. The original image-buffer names are retained for CCS Image inspection, while additional integer arrays support CCS Graph. Native execution of the portable C sources passes 122 checks. The same MATLAB-compatible script is executed using GNU Octave 9.4.0 on the server; all seven image outputs match the C results exactly, and 41 figures are generated. The worst stopband attenuation is approximately 57.57 dB and the largest passband ripple is approximately 0.0196 dB. The script can be rerun in MATLAB on the user’s local computer. Target compilation and physical-board experiments remain distinct from these server-side algorithm checks.</w:t>
+      </w:r>
+    </w:p>
+    <w:p>
+      <w:pPr>
+        <w:pStyle w:val="BodyText"/>
+        <w:ind w:firstLine="480"/>
+      </w:pPr>
+      <w:r>
+        <w:t xml:space="preserve">Keywords: C5509; fixed image; FIR; FFT; AM; DSB; CCS</w:t>
       </w:r>
     </w:p>
     <w:bookmarkEnd w:id="21"/>
@@ -167,7 +167,7 @@
         <w:ind w:firstLine="480"/>
       </w:pPr>
       <w:r>
-        <w:t xml:space="preserve">既有程序提供了 80×80 图像缓冲区与数字按键读取接口，原先按键 1、2 产生内置图并执行 Sobel，其他若干键控制发光器件。这一基础已经包含可复用的板级入口，但尚未覆盖本次选定的滤波器、FFT 和 AM/DSB 任务。因此，本设计以保留可识别硬件路径为前提改造应用层，增加明确的参数状态、可观察的完成标志和主机辅助工具，使算法结果有稳定的查看入口。</w:t>
+        <w:t xml:space="preserve">既有程序提供了 80×80 图像缓冲区与数字按键读取接口，原先按键 1、2 产生内置图并执行 Sobel，其他若干键控制发光器件。这一基础已经包含可复用的板级入口，但尚未覆盖本次选定的滤波器、FFT 和 AM/DSB 任务。因此，本设计以保留可识别硬件路径为前提改造应用层，增加明确的参数状态、可观察的完成标志和CCS 观察缓冲区，使算法结果有稳定的查看入口。</w:t>
       </w:r>
     </w:p>
     <w:bookmarkEnd w:id="22"/>
@@ -186,16 +186,16 @@
         <w:ind w:firstLine="480"/>
       </w:pPr>
       <w:r>
-        <w:t xml:space="preserve">基础部分选取 FIR 滤波器和 FFT，专业部分选取 AM、DSB 调制；实践目标是完成对应开发系统的编译、连接、下载与运行验证。评分文件要求正文不少于 5000 字、原则上不超过 10000 字，并包含中英文摘要及规范图表。所提供文件属于评分标准，没有附带教务处专用报告模板，因此本稿先按通用课程设计结构组织，最终提交时应套用教师指定封面。</w:t>
-      </w:r>
-    </w:p>
-    <w:p>
-      <w:pPr>
-        <w:pStyle w:val="BodyText"/>
-        <w:ind w:firstLine="480"/>
-      </w:pPr>
-      <w:r>
-        <w:t xml:space="preserve">平台识别依据是原 Key.pjt 的 TMS320C55XX 设置、构建日志中的 cl55、C55x 运行库以及 ICETEK-VC5509 寄存器映射。这些证据一致指向 C5509 教学平台。另一份附件名称包含 DSP28335，但因文件超过当前传输上限尚未读取，实物型号也没有得到确认。故本报告讨论原 C5509 工程的软件实现，不把它宣称为 F28335 工程。物理下载前必须核对板型；若实际使用 F28335，应重新完成板级移植。</w:t>
+        <w:t xml:space="preserve">本次基础部分选择 FIR 滤波器与 FFT，专业部分选择 AM、DSB，实践部分沿用原实验箱进行编译、连接、下载和观察。原《DSP实习实验》记录明确列出 ICETEK–VC5509-A 板、Setup CCStudio 中的 C5509A XDS510 Emulator，以及 Code Composer Studio v3.3。报告中原融合实验的 Key.c 还保留了 PLL_Init(20)、SDRAM_init、InitCTR、GetKey 和 9 键退出。这些记录与提供的 v61 工程相互印证，确定本次使用原 C55x 平台，而非根据另一份手册文件名更换处理器。</w:t>
+      </w:r>
+    </w:p>
+    <w:p>
+      <w:pPr>
+        <w:pStyle w:val="BodyText"/>
+        <w:ind w:firstLine="480"/>
+      </w:pPr>
+      <w:r>
+        <w:t xml:space="preserve">系统环境和验证入口保持一致，并不意味着应用代码完全不变。新功能仍需增加算法源文件、系数和显示数据，但不要求改变虚拟机操作系统、下载器、CCS 主版本或外设接线。评分标准要求正文不少于 5000 字并有中英文摘要，本稿按课程设计结构组织；未提供学校专用排版模板，最终封面信息应由本人核实填写。</w:t>
       </w:r>
     </w:p>
     <w:bookmarkEnd w:id="23"/>
@@ -209,87 +209,96 @@
         <w:t xml:space="preserve">2　总体方案与数据组织</w:t>
       </w:r>
     </w:p>
-    <w:bookmarkStart w:id="25" w:name="模块划分"/>
+    <w:bookmarkStart w:id="25" w:name="沿用原工程的模块组织"/>
     <w:p>
       <w:pPr>
         <w:pStyle w:val="Heading2"/>
       </w:pPr>
       <w:r>
-        <w:t xml:space="preserve">2.1　模块划分</w:t>
-      </w:r>
-    </w:p>
-    <w:p>
-      <w:pPr>
-        <w:pStyle w:val="FirstParagraph"/>
-        <w:ind w:firstLine="480"/>
-      </w:pPr>
-      <w:r>
-        <w:t xml:space="preserve">系统由按键状态机、图源管理、FIR 运算、FFT 运算、调制运算和主机显示工具组成。主循环先完成原 PLL、SDRAM 与控制板初始化，再读取按键。按键 1—7 对应低通、带通、带阻、C DIT FFT、DIF 汇编构建后端、AM 与 DSB；按键 8 修改截止频率索引，按键 9 修改图源。无效按键不发布新结果，避免在无操作时重复覆盖可观察数据。</w:t>
-      </w:r>
-    </w:p>
-    <w:p>
-      <w:pPr>
-        <w:pStyle w:val="BodyText"/>
-        <w:ind w:firstLine="480"/>
-      </w:pPr>
-      <w:r>
-        <w:t xml:space="preserve">数据流为“选择图源—装载输入—执行当前模式—填写结果状态—发布完成点”。gBusy 表示运算是否进行，gResultSeq 是完成序号，gResultMode 等变量记录与当前缓冲区对应的参数。调试器应在完成点暂停再刷新图像，而不能在卷积尚未写完整时读取整帧。该设计把计算状态与调试器显示状态联系起来，使一次按键操作能够对应一份一致的输出。</w:t>
+        <w:t xml:space="preserve">2.1　沿用原工程的模块组织</w:t>
+      </w:r>
+    </w:p>
+    <w:p>
+      <w:pPr>
+        <w:pStyle w:val="FirstParagraph"/>
+        <w:ind w:firstLine="480"/>
+      </w:pPr>
+      <w:r>
+        <w:t xml:space="preserve">主程序保留原初始化顺序和循环读取按键的方式。按键 1、2、3 选择低通、带通、带阻，4、5 分别选择 DIT 和 DIF FFT，6、7 选择 AM 与 DSB，8 调整滤波参数，9 像原程序一样退出并关闭 CTR。普通 Key.pjt 直接编译所需 C 源码，没有目标端 Python、文件转换工具或缺失汇编文件的前置依赖，输出仍为 Debug/key.out。</w:t>
+      </w:r>
+    </w:p>
+    <w:p>
+      <w:pPr>
+        <w:pStyle w:val="BodyText"/>
+        <w:ind w:firstLine="480"/>
+      </w:pPr>
+      <w:r>
+        <w:t xml:space="preserve">程序按“复制固定图—执行算法—更新 Graph 数据—发布完成状态”的顺序运行。gBusy 为计算标志，gResultSeq 为完成序号，gLastKey、gMode 和 gCutoffIndex 供 Watch 观察。两次按键之间程序只轮询输入，不持续重写结果，所以处理结束后可以 Halt 并刷新图像。暂停期间不扫描按键，必须先 Run 再按键，这是保持原实验操作习惯时需要明确的条件。</w:t>
       </w:r>
     </w:p>
     <w:bookmarkEnd w:id="25"/>
-    <w:bookmarkStart w:id="26" w:name="图像与一维信号的区分"/>
+    <w:bookmarkStart w:id="26" w:name="固定照片及加载方式"/>
     <w:p>
       <w:pPr>
         <w:pStyle w:val="Heading2"/>
       </w:pPr>
       <w:r>
-        <w:t xml:space="preserve">2.2　图像与一维信号的区分</w:t>
-      </w:r>
-    </w:p>
-    <w:p>
-      <w:pPr>
-        <w:pStyle w:val="FirstParagraph"/>
-        <w:ind w:firstLine="480"/>
-      </w:pPr>
-      <w:r>
-        <w:t xml:space="preserve">dbImage 为当前输入，dbTargetImage 为结果，dbUserImage 为预先导入的用户图片；三者均为 6400 个像素元素。内置图源包括条纹与径向渐变，外部图片由主机先灰度化、缩放，再通过 CCS 写入目标内存。DSP 不直接读取宿主文件系统，因而不依赖目标端 fopen 或调试器文件输入输出服务。</w:t>
-      </w:r>
-    </w:p>
-    <w:p>
-      <w:pPr>
-        <w:pStyle w:val="BodyText"/>
-        <w:ind w:firstLine="480"/>
-      </w:pPr>
-      <w:r>
-        <w:t xml:space="preserve">图像沿一行排列时属于空间离散信号，其横轴单位是像素，频率单位应写成每像素周期数。课设规定的 kHz 指标则由另一路一维测试信号验证，采样率定义为 32 kHz。系统保留 gSignalIn、gSignalOut 和复数 FFT 数组，将数值实验与图片演示联系起来，同时保留物理意义的区别。图片滤波用于观察平滑、纹理选择和频谱变化，一维信号用于确认截止频率和调制边带。</w:t>
+        <w:t xml:space="preserve">2.2　固定照片及加载方式</w:t>
+      </w:r>
+    </w:p>
+    <w:p>
+      <w:pPr>
+        <w:pStyle w:val="FirstParagraph"/>
+        <w:ind w:firstLine="480"/>
+      </w:pPr>
+      <w:r>
+        <w:t xml:space="preserve">示例采用 NASA 宇航员 Eileen Collins 的公有领域照片，经灰度化和尺寸统一形成 80×80 的 sample.bmp。相同的 6400 个像素已经生成 ImageData.h 中的只读数组。原图文件放在 v61 中方便查看，本机仿真也读取这一文件；DSP 真正使用的是编译进程序的像素，不执行 fopen，也不读取宿主磁盘路径。因此图片随程序下载，不需要每次在电脑上选文件或通过 Memory Load 装入数据。</w:t>
+      </w:r>
+    </w:p>
+    <w:p>
+      <w:pPr>
+        <w:pStyle w:val="BodyText"/>
+        <w:ind w:firstLine="480"/>
+      </w:pPr>
+      <w:r>
+        <w:t xml:space="preserve">这种组织方式解决了旧实验已屏蔽 BMP 文件读取的问题，同时保持可追溯性。服务器逐像素核对了位图与编译后 C 输入缓冲区的一致性，确保仿真和目标源程序使用同一张图。输入缓冲区仍叫 dbImage，输出仍叫 dbTargetImage，均为 80×80，便于直接复用原 Image 窗口设置。更换图片需要同步更新位图和头文件，不能只替换磁盘文件后假定 DSP 内容已变。</w:t>
       </w:r>
     </w:p>
     <w:bookmarkEnd w:id="26"/>
-    <w:bookmarkStart w:id="27" w:name="定点表示与存储安排"/>
+    <w:bookmarkStart w:id="27" w:name="字长缓冲区与物理含义"/>
     <w:p>
       <w:pPr>
         <w:pStyle w:val="Heading2"/>
       </w:pPr>
       <w:r>
-        <w:t xml:space="preserve">2.3　定点表示与存储安排</w:t>
-      </w:r>
-    </w:p>
-    <w:p>
-      <w:pPr>
-        <w:pStyle w:val="FirstParagraph"/>
-        <w:ind w:firstLine="480"/>
-      </w:pPr>
-      <w:r>
-        <w:t xml:space="preserve">C5509 的 char、short 和 int 通常为 16 位，long 为 32 位；普通主机的 char 通常为 8 位。本设计用明确的 16 位样本和 32 位累加类型组织运算，主机构建时使用固定宽度类型，不假设两者的 sizeof 完全相同。图片灰度值仍限定为 0—255，但在目标端每个像素占一个 16 位存储字，主机 .dat 工具据此输出 6400 个字。</w:t>
-      </w:r>
-    </w:p>
-    <w:p>
-      <w:pPr>
-        <w:pStyle w:val="BodyText"/>
-        <w:ind w:firstLine="480"/>
-      </w:pPr>
-      <w:r>
-        <w:t xml:space="preserve">原工程把较多数据放在 DARAM2，新增加的系数表与用户图会加大占用，因此链接配置把大数组、常量和初始化数据安排到片内 SARAM，堆栈保留在 DARAM2。系数表共有 28×257=7196 个定点字，三幅图片共 19200 个像素字，四个 256 点信号/复数分量数组共 1024 个字。这一规模要求在真实目标 map 中核对，而不能只根据主机编译成功判断 DSP 内存足够。</w:t>
+        <w:t xml:space="preserve">2.3　字长、缓冲区与物理含义</w:t>
+      </w:r>
+    </w:p>
+    <w:p>
+      <w:pPr>
+        <w:pStyle w:val="FirstParagraph"/>
+        <w:ind w:firstLine="480"/>
+      </w:pPr>
+      <w:r>
+        <w:t xml:space="preserve">C5509 的 unsigned char 是 16 位目标字，普通电脑的 char 通常为 8 位。程序保持原图像声明方式，每个像素是一个目标元素，灰度值限定为 0—255；计算样本用 16 位短整型，乘加用 32 位中间量。主机检查仅调整基础类型的宽度，不改变算法、系数或边界规则。目标端的字长语义应与原 CCS 的数据格式一致，不能按电脑的两个八位像素拼接方式读取。</w:t>
+      </w:r>
+    </w:p>
+    <w:p>
+      <w:pPr>
+        <w:pStyle w:val="BodyText"/>
+        <w:ind w:firstLine="480"/>
+      </w:pPr>
+      <w:r>
+        <w:t xml:space="preserve">两个可写图像共 12800 个目标字，固定只读图像为 6400 个字，滤波表为 7196 个字；还需要行曲线、复数 FFT 和一维信号数组。新增规模超过原较小数据区的舒适范围，故把大数组和常量放在片内 SARAM，堆栈仍保留独立区域。该内存安排应通过本地 map 文件复核，不在服务器上凭空宣称目标链接成功。</w:t>
+      </w:r>
+    </w:p>
+    <w:p>
+      <w:pPr>
+        <w:pStyle w:val="BodyText"/>
+        <w:ind w:firstLine="480"/>
+      </w:pPr>
+      <w:r>
+        <w:t xml:space="preserve">图片是一种空间离散信号，横轴单位为像素，频率应以 cycles/pixel 表示。课设的 kHz 指标由另一组采样率 32 kHz 的一维信号验证。gInputRow、gOutputRow 保存图片第 40 行，gFFTMag 保存频谱幅度；gSignalIn、gSignalOut 保存独立时间信号。Image 与 Graph 都属于原 CCS 环境中的观察工具，不需要引入额外图形程序。</w:t>
       </w:r>
     </w:p>
     <w:bookmarkEnd w:id="27"/>
@@ -421,14 +430,14 @@
       <w:r>
         <w:drawing>
           <wp:inline>
-            <wp:extent cx="5334000" cy="4267200"/>
+            <wp:extent cx="5334000" cy="4121515"/>
             <wp:effectExtent b="0" l="0" r="0" t="0"/>
-            <wp:docPr descr="代表性量化 FIR 幅相响应（Python/SciPy 生成）" title="" id="33" name="Picture"/>
+            <wp:docPr descr="代表性量化 FIR 幅相响应（交付的 .m 实际生成）" title="" id="33" name="Picture"/>
             <a:graphic>
               <a:graphicData uri="http://schemas.openxmlformats.org/drawingml/2006/picture">
                 <pic:pic>
                   <pic:nvPicPr>
-                    <pic:cNvPr descr="../results/figures/bode_summary.png" id="34" name="Picture"/>
+                    <pic:cNvPr descr="../code/simulation_results/bode_summary.png" id="34" name="Picture"/>
                     <pic:cNvPicPr>
                       <a:picLocks noChangeArrowheads="1" noChangeAspect="1"/>
                     </pic:cNvPicPr>
@@ -442,7 +451,7 @@
                   <pic:spPr bwMode="auto">
                     <a:xfrm>
                       <a:off x="0" y="0"/>
-                      <a:ext cx="5334000" cy="4267200"/>
+                      <a:ext cx="5334000" cy="4121515"/>
                     </a:xfrm>
                     <a:prstGeom prst="rect">
                       <a:avLst/>
@@ -466,7 +475,7 @@
         <w:pStyle w:val="ImageCaption"/>
       </w:pPr>
       <w:r>
-        <w:t xml:space="preserve">代表性量化 FIR 幅相响应（Python/SciPy 生成）</w:t>
+        <w:t xml:space="preserve">代表性量化 FIR 幅相响应（交付的 .m 实际生成）</w:t>
       </w:r>
     </w:p>
     <w:p>
@@ -476,7 +485,7 @@
         <w:jc w:val="center"/>
       </w:pPr>
       <w:r>
-        <w:t xml:space="preserve">图 1　代表性低通、带通及带阻波特图。全部 28 组幅相图及全部抽头另随数据附件提供。</w:t>
+        <w:t xml:space="preserve">图 1　代表性低通、带通及带阻波特图，由 GNU Octave 9.4.0 执行 .m 生成，全部图在 simulation_results。</w:t>
       </w:r>
     </w:p>
     <w:bookmarkEnd w:id="35"/>
@@ -533,16 +542,16 @@
         <w:ind w:firstLine="480"/>
       </w:pPr>
       <w:r>
-        <w:t xml:space="preserve">C 版本采用时间抽取 DIT：先按位反转输入，再按 2、4 至 256 的跨度进行蝶形，输出为自然顺序。另一版本采用频率抽取 DIF：先以 256 点跨度进行和差运算，逐级减小跨度，最后对输出做位反转。两种结构在数学上相同，但舍入位置不同，因此定点结果允许存在几个整数计数的差别。</w:t>
-      </w:r>
-    </w:p>
-    <w:p>
-      <w:pPr>
-        <w:pStyle w:val="BodyText"/>
-        <w:ind w:firstLine="480"/>
-      </w:pPr>
-      <w:r>
-        <w:t xml:space="preserve">本交付为 DIF 提供完整的独立源描述和目标构建流程。构建时由 TI 编译器输出 C55x 汇编，再把生成的汇编文件作为实际输入重新汇编链接。其性质是编译器生成汇编，不是手写优化汇编。云端尚未取得可用的 TI 工具链，因而没有宣称真实 .asm 已生成、汇编已通过或目标周期已经测量。若课程把“汇编实现”限定为手写源程序，该要求仍需补充，不能仅凭构建路径视为已满足。</w:t>
+        <w:t xml:space="preserve">C 版本采用时间抽取 DIT，先对输入做位反转，再按 2、4 至 256 的跨度执行蝶形，输出为自然顺序。对照版本采用频率抽取 DIF，先计算大跨度和差，再逐级减小跨度，最后重排输出。两者数学变换相同，但定点舍入位置不同，结果可以相差几个整数计数，不能只检查预览图是否相似。</w:t>
+      </w:r>
+    </w:p>
+    <w:p>
+      <w:pPr>
+        <w:pStyle w:val="BodyText"/>
+        <w:ind w:firstLine="480"/>
+      </w:pPr>
+      <w:r>
+        <w:t xml:space="preserve">为满足原工程直接 Build 的操作方式，普通项目编译两个独立 C 描述。项目用 -k -ss 保留编译器实际产生的汇编，例如 Debug/fft_dif_backend.asm，供本地构建后查看。该汇编来自 TI 编译器，不是手写 FFT；若教师要求手写完整汇编，这一项仍未满足，应另外补充。服务器没有 cl55，不能把尚未生成的目标汇编或未测量的指令周期写成已完成。</w:t>
       </w:r>
     </w:p>
     <w:bookmarkEnd w:id="38"/>
@@ -589,16 +598,16 @@
         <w:ind w:firstLine="480"/>
       </w:pPr>
       <w:r>
-        <w:t xml:space="preserve">精确 FFT 结果保存为实部和虚部数组，主机计算平方和开方得到复数幅值。为了让目标上的 80×80 窗口能够快速显示，预览采用实部绝对值与虚部绝对值之和，并把相邻频点的峰值映射为柱高。该预览可用于观察谱峰位置，却不是精确幅值刻度；定量结果应读取原始复数数组，不能由小图柱高反推绝对增益。</w:t>
-      </w:r>
-    </w:p>
-    <w:p>
-      <w:pPr>
-        <w:pStyle w:val="BodyText"/>
-        <w:ind w:firstLine="480"/>
-      </w:pPr>
-      <w:r>
-        <w:t xml:space="preserve">图片谱图的横轴应为 cycles/pixel；独立时间信号谱图才使用 kHz。该区分也适用于报告答辩：第 4、5 键展示的是一维图像行的频谱，不是完整二维 FFT，更不是经过频域滤波后重建的图片。若进一步做二维变换，需要增加列方向处理和逆变换，本次实现没有把这些扩展内容写成已完成成果。</w:t>
+        <w:t xml:space="preserve">FFT 实部与虚部保存在 gFFTReal、gFFTImag，程序再用整数平方根计算幅度，取整数部分保存到 gFFTMag。服务器把每一项与独立复数幅度比较，确认 Graph 使用的数据没有把实部误当作幅值。对于 80×80 结果窗口，将 129 个非负频点分组取峰值并按最大幅度映射为柱高，所以 Image 能显示频谱形状，Graph 则可读取原始幅度数组。</w:t>
+      </w:r>
+    </w:p>
+    <w:p>
+      <w:pPr>
+        <w:pStyle w:val="BodyText"/>
+        <w:ind w:firstLine="480"/>
+      </w:pPr>
+      <w:r>
+        <w:t xml:space="preserve">图片谱图横轴为 cycles/pixel，一维信号谱图才使用 kHz。第 4、5 键展示的是照片中间一行的频谱，不是二维 FFT 或逆变换后的重建照片。Image 的柱高经过屏幕归一化，不能用像素高度代替绝对增益；定量比较应读取复数或幅度数组。该范围界定避免把一维教学实验描述成更复杂的二维处理系统。</w:t>
       </w:r>
     </w:p>
     <w:p>
@@ -608,14 +617,14 @@
       <w:r>
         <w:drawing>
           <wp:inline>
-            <wp:extent cx="5334000" cy="3200400"/>
+            <wp:extent cx="5334000" cy="3467228"/>
             <wp:effectExtent b="0" l="0" r="0" t="0"/>
-            <wp:docPr descr="FFT 独立参考比较（便携 C 与 Python 生成）" title="" id="41" name="Picture"/>
+            <wp:docPr descr="照片中间行的 FFT 比较：实际执行 .m 脚本生成" title="" id="41" name="Picture"/>
             <a:graphic>
               <a:graphicData uri="http://schemas.openxmlformats.org/drawingml/2006/picture">
                 <pic:pic>
                   <pic:nvPicPr>
-                    <pic:cNvPr descr="../results/figures/fft_validation.png" id="42" name="Picture"/>
+                    <pic:cNvPr descr="../code/simulation_results/image_fft.png" id="42" name="Picture"/>
                     <pic:cNvPicPr>
                       <a:picLocks noChangeArrowheads="1" noChangeAspect="1"/>
                     </pic:cNvPicPr>
@@ -629,7 +638,7 @@
                   <pic:spPr bwMode="auto">
                     <a:xfrm>
                       <a:off x="0" y="0"/>
-                      <a:ext cx="5334000" cy="3200400"/>
+                      <a:ext cx="5334000" cy="3467228"/>
                     </a:xfrm>
                     <a:prstGeom prst="rect">
                       <a:avLst/>
@@ -653,7 +662,7 @@
         <w:pStyle w:val="ImageCaption"/>
       </w:pPr>
       <w:r>
-        <w:t xml:space="preserve">FFT 独立参考比较（便携 C 与 Python 生成）</w:t>
+        <w:t xml:space="preserve">照片中间行的 FFT 比较：实际执行 .m 脚本生成</w:t>
       </w:r>
     </w:p>
     <w:p>
@@ -663,7 +672,7 @@
         <w:jc w:val="center"/>
       </w:pPr>
       <w:r>
-        <w:t xml:space="preserve">图 2　相干多音输入及归一化频谱。DIT 为实际主机 C 执行，DIF 为待生成目标汇编的独立源模型。</w:t>
+        <w:t xml:space="preserve">图 2　固定照片行样本与归一化频谱，.m 脚本由 GNU Octave 9.4.0 执行。</w:t>
       </w:r>
     </w:p>
     <w:bookmarkEnd w:id="43"/>
@@ -739,14 +748,14 @@
       <w:r>
         <w:drawing>
           <wp:inline>
-            <wp:extent cx="5334000" cy="3200400"/>
+            <wp:extent cx="5334000" cy="4002420"/>
             <wp:effectExtent b="0" l="0" r="0" t="0"/>
-            <wp:docPr descr="AM 与 DSB 波形及频谱（实际主机 C 输出，Python 绘图）" title="" id="47" name="Picture"/>
+            <wp:docPr descr="AM 与 DSB 波形及频谱（交付的 .m 实际生成）" title="" id="47" name="Picture"/>
             <a:graphic>
               <a:graphicData uri="http://schemas.openxmlformats.org/drawingml/2006/picture">
                 <pic:pic>
                   <pic:nvPicPr>
-                    <pic:cNvPr descr="../results/figures/modulation_validation.png" id="48" name="Picture"/>
+                    <pic:cNvPr descr="../code/simulation_results/modulation.png" id="48" name="Picture"/>
                     <pic:cNvPicPr>
                       <a:picLocks noChangeArrowheads="1" noChangeAspect="1"/>
                     </pic:cNvPicPr>
@@ -760,7 +769,7 @@
                   <pic:spPr bwMode="auto">
                     <a:xfrm>
                       <a:off x="0" y="0"/>
-                      <a:ext cx="5334000" cy="3200400"/>
+                      <a:ext cx="5334000" cy="4002420"/>
                     </a:xfrm>
                     <a:prstGeom prst="rect">
                       <a:avLst/>
@@ -784,7 +793,7 @@
         <w:pStyle w:val="ImageCaption"/>
       </w:pPr>
       <w:r>
-        <w:t xml:space="preserve">AM 与 DSB 波形及频谱（实际主机 C 输出，Python 绘图）</w:t>
+        <w:t xml:space="preserve">AM 与 DSB 波形及频谱（交付的 .m 实际生成）</w:t>
       </w:r>
     </w:p>
     <w:p>
@@ -794,139 +803,167 @@
         <w:jc w:val="center"/>
       </w:pPr>
       <w:r>
-        <w:t xml:space="preserve">图 3　AM 的载波与双边带、DSB 的双边带分布。</w:t>
+        <w:t xml:space="preserve">图 3　AM 的载波与双边带、DSB 的双边带分布；.m 结果已逐点核对 C 输出。</w:t>
       </w:r>
     </w:p>
     <w:bookmarkEnd w:id="49"/>
     <w:bookmarkEnd w:id="50"/>
-    <w:bookmarkStart w:id="53" w:name="程序运行与主机交互"/>
+    <w:bookmarkStart w:id="54" w:name="原实验操作与结果观察"/>
     <w:p>
       <w:pPr>
         <w:pStyle w:val="Heading1"/>
       </w:pPr>
       <w:r>
-        <w:t xml:space="preserve">6　程序运行与主机交互</w:t>
-      </w:r>
-    </w:p>
-    <w:bookmarkStart w:id="51" w:name="按键与状态发布"/>
+        <w:t xml:space="preserve">6　原实验操作与结果观察</w:t>
+      </w:r>
+    </w:p>
+    <w:bookmarkStart w:id="51" w:name="从原工程到按键处理"/>
     <w:p>
       <w:pPr>
         <w:pStyle w:val="Heading2"/>
       </w:pPr>
       <w:r>
-        <w:t xml:space="preserve">6.1　按键与状态发布</w:t>
-      </w:r>
-    </w:p>
-    <w:p>
-      <w:pPr>
-        <w:pStyle w:val="FirstParagraph"/>
-        <w:ind w:firstLine="480"/>
-      </w:pPr>
-      <w:r>
-        <w:t xml:space="preserve">原程序在图像处理后使用较长延时，新增程序改为运算结束发布序号，再返回按键循环。模式和频率索引分别保存，切换到带通或带阻时把索引规整到九个合法频带内。按键 9 只在已设置用户图片就绪标志时才把用户图加入轮换，避免首次进入未初始化数据。</w:t>
-      </w:r>
-    </w:p>
-    <w:p>
-      <w:pPr>
-        <w:pStyle w:val="BodyText"/>
-        <w:ind w:firstLine="480"/>
-      </w:pPr>
-      <w:r>
-        <w:t xml:space="preserve">gCommand 允许通过调试器写入 1—9 触发同样的应用逻辑，主要用于区分算法问题与按键硬件问题。它并不替代物理按键验收；最终仍需检查真实 GetKey 返回值、键码与输出的对应关系。完成断点与序号配合使用，可以确定一次刷新来自当前操作，避免误读先前保留在窗口中的旧图。</w:t>
+        <w:t xml:space="preserve">6.1　从原工程到按键处理</w:t>
+      </w:r>
+    </w:p>
+    <w:p>
+      <w:pPr>
+        <w:pStyle w:val="FirstParagraph"/>
+        <w:ind w:firstLine="480"/>
+      </w:pPr>
+      <w:r>
+        <w:t xml:space="preserve">实际使用只需将新版 v61 复制到原 Lab0404-key 目录，沿用 C5509A XDS510 Emulator 连接 CCS 3.3，打开 Key.pjt，Build 并加载 Debug/key.out。初始化后程序对固定照片执行默认 4 kHz 低通，随后等待按键。切换模式时重新从只读照片复制输入，避免把上一次结果当作下一次输入，使不同算法都作用于同一张照片。</w:t>
+      </w:r>
+    </w:p>
+    <w:p>
+      <w:pPr>
+        <w:pStyle w:val="BodyText"/>
+        <w:ind w:firstLine="480"/>
+      </w:pPr>
+      <w:r>
+        <w:t xml:space="preserve">按键 8 对低通循环十个截止值，对带通、带阻循环九个相邻频带；进入带通或带阻时把参数规整到合法范围。按键 9 保持原退出语义，不再用于切换图源。退出后若继续实验需 Restart 或重新装载，而不是认为退出后的按键仍会被扫描。gResultSeq 只在完整处理后增加，可用于判断刷新窗口中的图是否来自当前操作。</w:t>
       </w:r>
     </w:p>
     <w:bookmarkEnd w:id="51"/>
-    <w:bookmarkStart w:id="52" w:name="图片加载与结果显示"/>
+    <w:bookmarkStart w:id="52" w:name="image-与-graph-的一致性"/>
     <w:p>
       <w:pPr>
         <w:pStyle w:val="Heading2"/>
       </w:pPr>
       <w:r>
-        <w:t xml:space="preserve">6.2　图片加载与结果显示</w:t>
-      </w:r>
-    </w:p>
-    <w:p>
-      <w:pPr>
-        <w:pStyle w:val="FirstParagraph"/>
-        <w:ind w:firstLine="480"/>
-      </w:pPr>
-      <w:r>
-        <w:t xml:space="preserve">用户原图先在主机由 Pillow 转为灰度并缩放到 80×80，再写为 CCS 十六进制文本。装载目标为 dbUserImage 的实际符号地址，文件头中的地址零只作占位，必须覆盖；不能把数据写进地址零。导入后设置 gUserImageReady，再选择用户图源并运行处理，下一次装载不会覆盖这一缓冲区。</w:t>
-      </w:r>
-    </w:p>
-    <w:p>
-      <w:pPr>
-        <w:pStyle w:val="BodyText"/>
-        <w:ind w:firstLine="480"/>
-      </w:pPr>
-      <w:r>
-        <w:t xml:space="preserve">观察结果优先使用 CCS 的图像工具；若版本没有相应插件，则保存源图与结果各 6400 个目标字，主机查看器读取导出的 .dat 并刷新。查看器每隔短时间检查文件是否改变，但不具备自动 JTAG 读取能力，所以每帧仍需在目标完成后由 CCS 导出。这个交互流程与现有代码的能力相符，没有引入未经实现的串口协议。</w:t>
+        <w:t xml:space="preserve">6.2　Image 与 Graph 的一致性</w:t>
+      </w:r>
+    </w:p>
+    <w:p>
+      <w:pPr>
+        <w:pStyle w:val="FirstParagraph"/>
+        <w:ind w:firstLine="480"/>
+      </w:pPr>
+      <w:r>
+        <w:t xml:space="preserve">Image 的源地址仍为 dbImage 和 dbTargetImage，宽高各 80，灰度范围为 0—255。用户可以复用原 Sobel 实验中已经成功的窗口配置。原报告没有提供参数对话框截图，不能逐字恢复所有菜单字段；若新建窗口，应注意每个 unsigned char 对应一个目标存储元素，必要时改用 16 位 Graph 数组检查数值，而不需要主机截图导出工具。</w:t>
+      </w:r>
+    </w:p>
+    <w:p>
+      <w:pPr>
+        <w:pStyle w:val="BodyText"/>
+        <w:ind w:firstLine="480"/>
+      </w:pPr>
+      <w:r>
+        <w:t xml:space="preserve">Graph 的 gInputRow 和 gOutputRow 各 80 个 16 位整数，取自当前源图和结果图的同一行；gFFTMag 为 129 点频谱幅度。它们在结果发布前更新，确保曲线与 Image 对应同一帧。正常操作是 Run、按键、等待完成、Halt、Refresh，再 Run 开始下一次。暂停时按键不会被程序读取，读取半帧数据也不能作为完整结果证据。</w:t>
       </w:r>
     </w:p>
     <w:bookmarkEnd w:id="52"/>
+    <w:bookmarkStart w:id="53" w:name="仿真留在本机"/>
+    <w:p>
+      <w:pPr>
+        <w:pStyle w:val="Heading2"/>
+      </w:pPr>
+      <w:r>
+        <w:t xml:space="preserve">6.3　仿真留在本机</w:t>
+      </w:r>
+    </w:p>
+    <w:p>
+      <w:pPr>
+        <w:pStyle w:val="FirstParagraph"/>
+        <w:ind w:firstLine="480"/>
+      </w:pPr>
+      <w:r>
+        <w:t xml:space="preserve">Matlab 文件夹与 v61 一起保留在本机，虚拟机只复制 v61。用户在 MATLAB 中切到 matlab 目录运行 run_all，即可读取相邻的 sample.bmp、设计系数、计算处理结果并输出到 simulation_results，不需要安装信号处理或图像处理工具箱。该步骤与板卡操作相互独立，不改变虚拟机环境。</w:t>
+      </w:r>
+    </w:p>
+    <w:p>
+      <w:pPr>
+        <w:pStyle w:val="BodyText"/>
+        <w:ind w:firstLine="480"/>
+      </w:pPr>
+      <w:r>
+        <w:t xml:space="preserve">服务器已经执行同一份 .m 文件，实际解释器为 GNU Octave 9.4.0，而非 MATLAB 商业软件。脚本自动把实际运行软件写入完成标记，并将七种结果与同一套 C 源码产生的参考数据比较。这样既能交付已经生成的图，也让用户在自己的 MATLAB 中复现，避免为了看图而给旧 CCS 虚拟机增加现代软件依赖。</w:t>
+      </w:r>
+    </w:p>
     <w:bookmarkEnd w:id="53"/>
-    <w:bookmarkStart w:id="60" w:name="验证方法与结果分析"/>
+    <w:bookmarkEnd w:id="54"/>
+    <w:bookmarkStart w:id="61" w:name="服务器验证与结果分析"/>
     <w:p>
       <w:pPr>
         <w:pStyle w:val="Heading1"/>
       </w:pPr>
       <w:r>
-        <w:t xml:space="preserve">7　验证方法与结果分析</w:t>
-      </w:r>
-    </w:p>
-    <w:bookmarkStart w:id="54" w:name="独立参考与测试覆盖"/>
+        <w:t xml:space="preserve">7　服务器验证与结果分析</w:t>
+      </w:r>
+    </w:p>
+    <w:bookmarkStart w:id="55" w:name="同一源程序的核对"/>
     <w:p>
       <w:pPr>
         <w:pStyle w:val="Heading2"/>
       </w:pPr>
       <w:r>
-        <w:t xml:space="preserve">7.1　独立参考与测试覆盖</w:t>
-      </w:r>
-    </w:p>
-    <w:p>
-      <w:pPr>
-        <w:pStyle w:val="FirstParagraph"/>
-        <w:ind w:firstLine="480"/>
-      </w:pPr>
-      <w:r>
-        <w:t xml:space="preserve">环境验证在 Linux 中实际编译同一组便携 C 源码，以 GCC 的严格警告设置和 C89 模式构建。滤波器频响使用独立频率响应计算，图像卷积使用独立镜像填充与数值卷积，FFT 与 NumPy 的复数结果比较，调制则检查特定频点。测试还覆盖零输入、冲激、直流、奈奎斯特模式、随机实数及复数输入，避免只用一张看似正常的图来判断算法。</w:t>
-      </w:r>
-    </w:p>
-    <w:p>
-      <w:pPr>
-        <w:pStyle w:val="BodyText"/>
-        <w:ind w:firstLine="480"/>
-      </w:pPr>
-      <w:r>
-        <w:t xml:space="preserve">61 项检查全部通过。零、冲激、直流及奈奎斯特输入在两种 FFT 源实现下的最大复数误差均为零；其他所测向量的最大误差低于六个整数计数，其中 C DIT 的随机输入约为 3.8321，DIF 源模型约为 2.5257。这些数据适用于测试的幅度范围与缩放约定，不应推广成任意满幅复数输入均无饱和的结论。</w:t>
-      </w:r>
-    </w:p>
-    <w:bookmarkEnd w:id="54"/>
-    <w:bookmarkStart w:id="58" w:name="图像结果解释"/>
+        <w:t xml:space="preserve">7.1　同一源程序的核对</w:t>
+      </w:r>
+    </w:p>
+    <w:p>
+      <w:pPr>
+        <w:pStyle w:val="FirstParagraph"/>
+        <w:ind w:firstLine="480"/>
+      </w:pPr>
+      <w:r>
+        <w:t xml:space="preserve">服务器以严格 C89 和警告设置编译普通 Key.pjt 中的便携算法源文件，并核对原板级文件的字节未变。实际执行的 122 项检查包括固定图片与 C 缓冲区一致性、默认工程引用文件是否齐全、28 组系数实际频响、全部频带的完整照片卷积、一维信号卷积、七种按键模式、Graph 数据、FFT 幅度及 9 键退出语义。驱动部分未在普通电脑上执行，避免把外设地址访问错误地解释成主机功能。</w:t>
+      </w:r>
+    </w:p>
+    <w:p>
+      <w:pPr>
+        <w:pStyle w:val="BodyText"/>
+        <w:ind w:firstLine="480"/>
+      </w:pPr>
+      <w:r>
+        <w:t xml:space="preserve">全部 28 组图像滤波都与独立镜像填充和数值卷积逐像素一致。量化后最差阻带衰减为 57.5688 dB，最大通带波动为 0.019525 dB；滤波测试同时检查实际通带绝对增益，防止全零系数也被低纹波指标误判通过。这些检查验证了目标源代码的数学行为，但不等于已经完成 C55x 指令仿真或实际下载。</w:t>
+      </w:r>
+    </w:p>
+    <w:bookmarkEnd w:id="55"/>
+    <w:bookmarkStart w:id="59" w:name="固定照片的处理结果"/>
     <w:p>
       <w:pPr>
         <w:pStyle w:val="Heading2"/>
       </w:pPr>
       <w:r>
-        <w:t xml:space="preserve">7.2　图像结果解释</w:t>
-      </w:r>
-    </w:p>
-    <w:p>
-      <w:pPr>
-        <w:pStyle w:val="FirstParagraph"/>
-        <w:ind w:firstLine="480"/>
-      </w:pPr>
-      <w:r>
-        <w:t xml:space="preserve">示例输入包含渐变、几何边缘和细条纹。低通使高频纹理减弱，带通保留选定空间变化并去除大部分直流，带阻抑制对应纹理频段。因为显示采用有符号中心恢复，带通平坦区呈中灰色；因为 FIR 有有限过渡带，边缘附近可能出现振铃。这些现象需要结合幅频响应解释，而不能简单地用“图像更清晰”概括所有滤波作用。</w:t>
-      </w:r>
-    </w:p>
-    <w:p>
-      <w:pPr>
-        <w:pStyle w:val="BodyText"/>
-        <w:ind w:firstLine="480"/>
-      </w:pPr>
-      <w:r>
-        <w:t xml:space="preserve">FFT 两种后端的图像预览整体一致，定量差异来自蝶形顺序与舍入。AM 与 DSB 的纹理图仅作运算效果展示，独立信号频谱则给出载波和边带的严格位置。主机执行结果与物理板图像应分别保存，文件中明确标注数据来源，以免论文图注混淆。</w:t>
+        <w:t xml:space="preserve">7.2　固定照片的处理结果</w:t>
+      </w:r>
+    </w:p>
+    <w:p>
+      <w:pPr>
+        <w:pStyle w:val="FirstParagraph"/>
+        <w:ind w:firstLine="480"/>
+      </w:pPr>
+      <w:r>
+        <w:t xml:space="preserve">低通图在水平方向减弱较细的变化，照片人物轮廓仍可辨认；带通图主要保留对应频带的局部纹理，直流被去除后大面积区域接近灰度 128；带阻图抑制指定纹理并保留部分低频结构。滤波沿行执行，边界采用镜像，因此不应把结果描述成各向同性二维平滑。有限窗函数还会造成过渡和振铃，需要与幅频响应结合分析。</w:t>
+      </w:r>
+    </w:p>
+    <w:p>
+      <w:pPr>
+        <w:pStyle w:val="BodyText"/>
+        <w:ind w:firstLine="480"/>
+      </w:pPr>
+      <w:r>
+        <w:t xml:space="preserve">照片行 FFT 的 DIT 最大复数误差约为 3.4270 个整数计数，DIF 约为 2.6880，参考使用 fft(x)/256。两者频谱峰位置与整体形状一致，差别主要来自定点舍入。Image 中的柱状图表示空间频谱，不能要求它继续保持照片外观。AM 和 DSB 的图片条纹是逐行调制结果，一维频谱则用于确认 8 kHz 载波与 7、9 kHz 边带。</w:t>
       </w:r>
     </w:p>
     <w:p>
@@ -936,20 +973,20 @@
       <w:r>
         <w:drawing>
           <wp:inline>
-            <wp:extent cx="5334000" cy="2667000"/>
+            <wp:extent cx="5334000" cy="2888000"/>
             <wp:effectExtent b="0" l="0" r="0" t="0"/>
-            <wp:docPr descr="七种模式的主机 C 图像输出" title="" id="56" name="Picture"/>
+            <wp:docPr descr="同一固定照片的七种结果：实际执行 .m 脚本生成" title="" id="57" name="Picture"/>
             <a:graphic>
               <a:graphicData uri="http://schemas.openxmlformats.org/drawingml/2006/picture">
                 <pic:pic>
                   <pic:nvPicPr>
-                    <pic:cNvPr descr="../results/figures/image_results.png" id="57" name="Picture"/>
+                    <pic:cNvPr descr="../code/simulation_results/image_results.png" id="58" name="Picture"/>
                     <pic:cNvPicPr>
                       <a:picLocks noChangeArrowheads="1" noChangeAspect="1"/>
                     </pic:cNvPicPr>
                   </pic:nvPicPr>
                   <pic:blipFill>
-                    <a:blip r:embed="rId55"/>
+                    <a:blip r:embed="rId56"/>
                     <a:stretch>
                       <a:fillRect/>
                     </a:stretch>
@@ -957,7 +994,7 @@
                   <pic:spPr bwMode="auto">
                     <a:xfrm>
                       <a:off x="0" y="0"/>
-                      <a:ext cx="5334000" cy="2667000"/>
+                      <a:ext cx="5334000" cy="2888000"/>
                     </a:xfrm>
                     <a:prstGeom prst="rect">
                       <a:avLst/>
@@ -981,7 +1018,7 @@
         <w:pStyle w:val="ImageCaption"/>
       </w:pPr>
       <w:r>
-        <w:t xml:space="preserve">七种模式的主机 C 图像输出</w:t>
+        <w:t xml:space="preserve">同一固定照片的七种结果：实际执行 .m 脚本生成</w:t>
       </w:r>
     </w:p>
     <w:p>
@@ -991,106 +1028,106 @@
         <w:jc w:val="center"/>
       </w:pPr>
       <w:r>
-        <w:t xml:space="preserve">图 4　相同用户图片的七种模式输出；本图不是开发板实拍或 CCS 硬件截屏。</w:t>
-      </w:r>
-    </w:p>
-    <w:bookmarkEnd w:id="58"/>
-    <w:bookmarkStart w:id="59" w:name="matlab-与目标验证状态"/>
+        <w:t xml:space="preserve">图 4　原图与低通、带通、带阻、DIT FFT、DIF FFT、AM、DSB 的结果。不是开发板截屏。</w:t>
+      </w:r>
+    </w:p>
+    <w:bookmarkEnd w:id="59"/>
+    <w:bookmarkStart w:id="60" w:name="m-脚本的实际执行"/>
     <w:p>
       <w:pPr>
         <w:pStyle w:val="Heading2"/>
       </w:pPr>
       <w:r>
-        <w:t xml:space="preserve">7.3　Matlab 与目标验证状态</w:t>
-      </w:r>
-    </w:p>
-    <w:p>
-      <w:pPr>
-        <w:pStyle w:val="FirstParagraph"/>
-        <w:ind w:firstLine="480"/>
-      </w:pPr>
-      <w:r>
-        <w:t xml:space="preserve">Matlab 脚本独立实现窗函数设计、Q15 量化、DIT/DIF 模型与调制，可输出全部 28 组幅相图、复数 FFT 对照及调制图，不依赖信号处理工具箱。随交付提供的 Python 图有明确来源，不能改写为已经运行 MATLAB 的结果。实际 MATLAB 执行后，应保留解释器版本、完整完成标记和本地输出，将相应图替换到最终报告。作为兼容性补充，已在 GNU Octave 9.4.0 中完整运行同一脚本，实际产生 30 张图及数值文件；全部 Q15 系数与交付表逐项一致，DIT、DIF 模型与对应主机 C 输出的整数差均为零。此记录保存在 octave_output，来源保持为 Octave。</w:t>
-      </w:r>
-    </w:p>
-    <w:p>
-      <w:pPr>
-        <w:pStyle w:val="BodyText"/>
-        <w:ind w:firstLine="480"/>
-      </w:pPr>
-      <w:r>
-        <w:t xml:space="preserve">目前目标编译器获取受网络策略限制，云端也没有实际开发板。故主机 C 验证、脚本兼容性验证、TI 目标汇编、JTAG 下载与 FLASH 脱机运行是不同层级，后两层尚不能填写“通过”。这种状态区分使已验证部分可以复现，也使后续实验知道具体还需要补充什么证据，而不是把未完成事项笼统写成整个系统失败或全部成功。</w:t>
-      </w:r>
-    </w:p>
-    <w:bookmarkEnd w:id="59"/>
+        <w:t xml:space="preserve">7.3　.m 脚本的实际执行</w:t>
+      </w:r>
+    </w:p>
+    <w:p>
+      <w:pPr>
+        <w:pStyle w:val="FirstParagraph"/>
+        <w:ind w:firstLine="480"/>
+      </w:pPr>
+      <w:r>
+        <w:t xml:space="preserve">服务器以 GNU Octave 9.4.0 执行交付的 run_all.m，实际生成 41 张 PNG，包括 28 组完整幅相图、原图和七种结果，以及汇总图、图像频谱、信号频谱与调制图。全部 7196 个系数整数与程序表一致，七种照片输出与实际 C 输出逐像素一致，DIT、DIF 的复数整数结果也与各自 C 实现一致。运行标记保留了实际解释器名称，MAT 文件使用兼容格式保存，便于本机读取。</w:t>
+      </w:r>
+    </w:p>
+    <w:p>
+      <w:pPr>
+        <w:pStyle w:val="BodyText"/>
+        <w:ind w:firstLine="480"/>
+      </w:pPr>
+      <w:r>
+        <w:t xml:space="preserve">论文插图直接采用这次 .m 运行产生的图，没有用此前主机模拟器截图或其他照片代替。用户可在本机 MATLAB 再运行同一脚本，得到本机标记和结果。服务器 C 检查、Octave 执行、MATLAB 本体运行以及 CCS 实验箱测试属于不同证据层级；当前只对前两层作通过结论。</w:t>
+      </w:r>
+    </w:p>
     <w:bookmarkEnd w:id="60"/>
-    <w:bookmarkStart w:id="63" w:name="虚拟机与硬件实践方案"/>
+    <w:bookmarkEnd w:id="61"/>
+    <w:bookmarkStart w:id="64" w:name="沿用原系统的硬件实践"/>
     <w:p>
       <w:pPr>
         <w:pStyle w:val="Heading1"/>
       </w:pPr>
       <w:r>
-        <w:t xml:space="preserve">8　虚拟机与硬件实践方案</w:t>
-      </w:r>
-    </w:p>
-    <w:bookmarkStart w:id="61" w:name="宿主与客体的分工"/>
+        <w:t xml:space="preserve">8　沿用原系统的硬件实践</w:t>
+      </w:r>
+    </w:p>
+    <w:bookmarkStart w:id="62" w:name="环境保持与连接检查"/>
     <w:p>
       <w:pPr>
         <w:pStyle w:val="Heading2"/>
       </w:pPr>
       <w:r>
-        <w:t xml:space="preserve">8.1　宿主与客体的分工</w:t>
-      </w:r>
-    </w:p>
-    <w:p>
-      <w:pPr>
-        <w:pStyle w:val="FirstParagraph"/>
-        <w:ind w:firstLine="480"/>
-      </w:pPr>
-      <w:r>
-        <w:t xml:space="preserve">若已有 Windows XP 虚拟机及可用的 CCS 3.3，应把它用于旧下载器与原工程；现代 Python 和图像查看器则放在 Windows 10/11 宿主或现代 Ubuntu 中。共享目录用于传递图片和导出结果。USB 下载器应连接到运行 CCS 的系统，同一时间避免宿主、客体同时占用。实际 USB 控制器版本和驱动选择必须依据下载器型号，不能从本报告推断硬件属于某一种 XDS 系列。</w:t>
-      </w:r>
-    </w:p>
-    <w:p>
-      <w:pPr>
-        <w:pStyle w:val="BodyText"/>
-        <w:ind w:firstLine="480"/>
-      </w:pPr>
-      <w:r>
-        <w:t xml:space="preserve">若客体实际为 Ubuntu，可以运行主机算法与脚本，但不能把 Windows 驱动或 exe 当作原生 Linux 程序使用。应先通过系统版本页面、板卡丝印、CCS Setup 和设备管理器恢复真实配置，再决定是否继续沿用旧虚拟机。整个流程不要求用户先重新安装操作系统，也避免破坏已有工作环境。</w:t>
-      </w:r>
-    </w:p>
-    <w:bookmarkEnd w:id="61"/>
-    <w:bookmarkStart w:id="62" w:name="目标编译下载与固化记录"/>
+        <w:t xml:space="preserve">8.1　环境保持与连接检查</w:t>
+      </w:r>
+    </w:p>
+    <w:p>
+      <w:pPr>
+        <w:pStyle w:val="FirstParagraph"/>
+        <w:ind w:firstLine="480"/>
+      </w:pPr>
+      <w:r>
+        <w:t xml:space="preserve">原报告证明实验曾在 ICETEK 5509 系统和 CCS 3.3/XDS510 中完成，因此本设计不要求改用其他开发平台。虚拟机仍只承担原编译、下载和调试任务，不安装 MATLAB、Python 或图像服务。键盘、CTR 电源及下载器接线也按原实验保留，只将新的 v61 文件夹放入原工程位置，避免在多个同名工程之间误加载旧 key.out。</w:t>
+      </w:r>
+    </w:p>
+    <w:p>
+      <w:pPr>
+        <w:pStyle w:val="BodyText"/>
+        <w:ind w:firstLine="480"/>
+      </w:pPr>
+      <w:r>
+        <w:t xml:space="preserve">原实验还记录过个人虚拟机无法连接而实验室电脑连接成功，说明环境名称相同不能直接证明 USB 直通和驱动可用。现场应先确认原驱动、目标配置和 Debug Connect 正常，再判断算法程序。若连接失败，应保存具体错误与设备信息；不通过更换未知芯片型号或随意改寄存器地址来绕过。服务器验证没有声称复现了虚拟机中的 JTAG 电气连接。</w:t>
+      </w:r>
+    </w:p>
+    <w:bookmarkEnd w:id="62"/>
+    <w:bookmarkStart w:id="63" w:name="编译下载与观察记录"/>
     <w:p>
       <w:pPr>
         <w:pStyle w:val="Heading2"/>
       </w:pPr>
       <w:r>
-        <w:t xml:space="preserve">8.2　目标编译、下载与固化记录</w:t>
-      </w:r>
-    </w:p>
-    <w:p>
-      <w:pPr>
-        <w:pStyle w:val="FirstParagraph"/>
-        <w:ind w:firstLine="480"/>
-      </w:pPr>
-      <w:r>
-        <w:t xml:space="preserve">目标构建采用原有大存储模式，先生成 DIF 汇编，再编译其他源文件并链接新版 course_design.out。须检查退出码、警告及 map，确认汇编源实际参与链接、各段位于合法区域后，再由匹配的目标配置装载。运行到完成断点后观察序号及图像，逐一测试七种功能、全部参数循环和用户图导入。</w:t>
-      </w:r>
-    </w:p>
-    <w:p>
-      <w:pPr>
-        <w:pStyle w:val="BodyText"/>
-        <w:ind w:firstLine="480"/>
-      </w:pPr>
-      <w:r>
-        <w:t xml:space="preserve">JTAG 向 RAM 下载并不等于固化 FLASH。FLASH 实践还需确认具体器件、厂商工具、启动开关、编程与校验结果，并在断开 JTAG、断电重启后复测。由于这些资料尚未提供，本报告仅给出验收表，真实实验结果、耗时和故障处理由实际操作者补填。若实物是 F28335，还必须先完成独立移植，不能执行本 C5509 下载步骤。</w:t>
-      </w:r>
-    </w:p>
-    <w:bookmarkEnd w:id="62"/>
+        <w:t xml:space="preserve">8.2　编译下载与观察记录</w:t>
+      </w:r>
+    </w:p>
+    <w:p>
+      <w:pPr>
+        <w:pStyle w:val="FirstParagraph"/>
+        <w:ind w:firstLine="480"/>
+      </w:pPr>
+      <w:r>
+        <w:t xml:space="preserve">本地先 Rebuild，检查 0 Errors、目标文件时间和 map 的内存占用，再 Load Program、Run。分别测试 1—7 键，确认 gLastKey、gMode、gResultSeq 与图像变化一致；再循环 8 键，验证所有合法滤波参数，最后测试 9 退出。Image 和 Graph 截图要与当前模式对应，不能使用论文中的仿真图作为硬件成功证明。</w:t>
+      </w:r>
+    </w:p>
+    <w:p>
+      <w:pPr>
+        <w:pStyle w:val="BodyText"/>
+        <w:ind w:firstLine="480"/>
+      </w:pPr>
+      <w:r>
+        <w:t xml:space="preserve">JTAG 向 RAM 装入 key.out 仅说明调试装载，不是 FLASH 固化。若所选实践还要求脱机运行，需要匹配板卡的官方工具、启动设置与真实擦写校验，并断开 JTAG、断电重启复测。当前没有这部分现场记录，本稿不预填成功结论。耗时和 CPU 使用率也应通过目标计时测得，不能根据软件 Delay 推算。</w:t>
+      </w:r>
+    </w:p>
     <w:bookmarkEnd w:id="63"/>
-    <w:bookmarkStart w:id="64" w:name="局限改进方向与结论"/>
+    <w:bookmarkEnd w:id="64"/>
+    <w:bookmarkStart w:id="65" w:name="局限改进方向与结论"/>
     <w:p>
       <w:pPr>
         <w:pStyle w:val="Heading1"/>
@@ -1105,29 +1142,29 @@
         <w:ind w:firstLine="480"/>
       </w:pPr>
       <w:r>
-        <w:t xml:space="preserve">本设计采用按键触发的整帧运算，没有完成 ADC/DAC 实时流、DMA 双缓冲和可测的实时调度。257 抽头逐行卷积具有一定计算量，原 Delay 的数值不能用于推断帧率。后续若需提高性能，可在真实目标计时后利用系数对称性减少乘法、改进缓冲组织，并针对处理器指令集优化热点，再以相同独立参考确认优化没有改变功能。</w:t>
-      </w:r>
-    </w:p>
-    <w:p>
-      <w:pPr>
-        <w:pStyle w:val="BodyText"/>
-        <w:ind w:firstLine="480"/>
-      </w:pPr>
-      <w:r>
-        <w:t xml:space="preserve">汇编路径当前由编译器生成，距离手写调优的完整 FFT 仍有区别。进一步工作包括取得目标工具链、核对实际板卡、完成真实汇编与硬件验证，以及在教师要求下提供手写版本。图像处理若需要二维效果，可扩展到二维频域设计，但需同时考虑额外内存、逆变换和幅度归一化，不能只把一维预览更名为二维系统。</w:t>
-      </w:r>
-    </w:p>
-    <w:p>
-      <w:pPr>
-        <w:pStyle w:val="BodyText"/>
-        <w:ind w:firstLine="480"/>
-      </w:pPr>
-      <w:r>
-        <w:t xml:space="preserve">已完成的软件部分把原按键工程转化为可选择滤波、频谱分析和幅度调制的应用框架，提供了完整系数、确定的定点规则、可复核的主机数值结果及操作流程。其主要收获是建立算法参数、有限精度、存储布局和观察方法之间的联系。最终课程报告应在本稿基础上补入本人完成的 MATLAB 与硬件实验记录，并用真实证据确认实践目标。</w:t>
-      </w:r>
-    </w:p>
-    <w:bookmarkEnd w:id="64"/>
-    <w:bookmarkStart w:id="65" w:name="参考文献"/>
+        <w:t xml:space="preserve">本设计针对原实验系统的按键整帧演示，没有实现 ADC/DAC 实时采集、DMA 流处理或二维图像通信链路。257 抽头行卷积需要一定处理时间，若后续要求更快响应，应先在实际 C5509 计时，再利用对称系数减少乘法，改进存储组织或优化汇编热点。优化后仍需用同一张图和独立数值参考复核，不能只以运行更快作为正确依据。</w:t>
+      </w:r>
+    </w:p>
+    <w:p>
+      <w:pPr>
+        <w:pStyle w:val="BodyText"/>
+        <w:ind w:firstLine="480"/>
+      </w:pPr>
+      <w:r>
+        <w:t xml:space="preserve">FFT 的普通构建保留 C 描述，并由编译器自动产生可查看的汇编；它与手写汇编优化仍有明确差别。若课程明确要求手写完整 FFT，需另行实现并在匹配工具链中验证。当前未通过目标编译或物理板卡测试的事项应继续记录为待验证，不因平台已确认就把所有新算法写成已经现场运行。</w:t>
+      </w:r>
+    </w:p>
+    <w:p>
+      <w:pPr>
+        <w:pStyle w:val="BodyText"/>
+        <w:ind w:firstLine="480"/>
+      </w:pPr>
+      <w:r>
+        <w:t xml:space="preserve">已完成的软件将原 Sobel 按键框架改造为固定照片的滤波、频谱和调制实验，保留了原板级入口、Image 缓冲区和 9 键退出习惯。固定数据内嵌程序消除了文件导入环节，本机 Matlab 仿真与虚拟机 CCS 调试各自独立。服务器实际 C 与 .m 数值交叉核对提供了可复现证据，用户随后只需按原系统完成编译、下载和观察，并将真实截图与体会补入实践记录。</w:t>
+      </w:r>
+    </w:p>
+    <w:bookmarkEnd w:id="65"/>
+    <w:bookmarkStart w:id="66" w:name="参考文献"/>
     <w:p>
       <w:pPr>
         <w:pStyle w:val="Heading1"/>
@@ -1187,7 +1224,7 @@
         <w:ind w:firstLine="480"/>
       </w:pPr>
       <w:r>
-        <w:t xml:space="preserve">[6] 用户提供的 v61.zip：Key.pjt、cc_build_Debug.log、ICETEK-VC5509-A.cmd 及板级源文件，原始版本见随附压缩包。</w:t>
+        <w:t xml:space="preserve">[6] 用户提供的 v61.zip：Key.pjt、cc_build_Debug.log、ICETEK-VC5509-A.cmd 及板级源文件，原始版本由用户保留。</w:t>
       </w:r>
     </w:p>
     <w:p>
@@ -1199,27 +1236,54 @@
         <w:t xml:space="preserve">[7] 数字系统综合设计课程论文评分标准；南京农业大学实习计划表：要求及内容。用户提供的课程资料。</w:t>
       </w:r>
     </w:p>
-    <w:bookmarkEnd w:id="65"/>
-    <w:bookmarkStart w:id="66" w:name="附录-a-随附数据与复现入口"/>
+    <w:p>
+      <w:pPr>
+        <w:pStyle w:val="BodyText"/>
+        <w:ind w:firstLine="480"/>
+      </w:pPr>
+      <w:r>
+        <w:t xml:space="preserve">[8] 用户提供的原《DSP实习实验》报告：C5509A XDS510、CCS 3.3 与融合实验记录。</w:t>
+      </w:r>
+    </w:p>
+    <w:p>
+      <w:pPr>
+        <w:pStyle w:val="BodyText"/>
+        <w:ind w:firstLine="480"/>
+      </w:pPr>
+      <w:r>
+        <w:t xml:space="preserve">[9] scikit-image 0.24.0. astronaut 数据：NASA 宇航员 Eileen Collins 公有领域照片，原始下载链接见代码包图片来源.txt。</w:t>
+      </w:r>
+    </w:p>
+    <w:bookmarkEnd w:id="66"/>
+    <w:bookmarkStart w:id="67" w:name="附录-a-代码与结果位置"/>
     <w:p>
       <w:pPr>
         <w:pStyle w:val="Heading1"/>
       </w:pPr>
       <w:r>
-        <w:t xml:space="preserve">附录 A　随附数据与复现入口</w:t>
-      </w:r>
-    </w:p>
-    <w:p>
-      <w:pPr>
-        <w:pStyle w:val="FirstParagraph"/>
-        <w:ind w:firstLine="480"/>
-      </w:pPr>
-      <w:r>
-        <w:t xml:space="preserve">滤波器全量系数：results/filter_coefficients.csv，含 7196 行抽头数据。全部滤波器指标：results/filter_specs.json。完整验证记录：results/validation.json。代表性数值输出：results/fft_c_and_dif.csv、am_c.csv、dsb_c.csv。全部幅相图：results/figures/all_28_bode_Python.pdf。Matlab 复现入口：matlab/run_all.m。目标工程入口：v61/Key.pjt 与 v61/build_c55x.bat。</w:t>
-      </w:r>
-    </w:p>
-    <w:bookmarkEnd w:id="66"/>
-    <w:bookmarkStart w:id="67" w:name="附录-b-实践补充页"/>
+        <w:t xml:space="preserve">附录 A　代码与结果位置</w:t>
+      </w:r>
+    </w:p>
+    <w:p>
+      <w:pPr>
+        <w:pStyle w:val="FirstParagraph"/>
+        <w:ind w:firstLine="480"/>
+      </w:pPr>
+      <w:r>
+        <w:t xml:space="preserve">原生工程入口：v61/Key.pjt；源图：v61/sample.bmp；相同内嵌像素：v61/ImageData.h；全量板上系数：v61/tables.c；Matlab 系数矩阵：matlab/coefficients_q15.csv；仿真入口：matlab/run_all.m；实际 C 对照数据：matlab/reference_c；完整 41 张图及完成标记：simulation_results。虚拟机只需 v61，Matlab 和结果保留在本机。</w:t>
+      </w:r>
+    </w:p>
+    <w:p>
+      <w:pPr>
+        <w:pStyle w:val="BodyText"/>
+        <w:ind w:firstLine="480"/>
+      </w:pPr>
+      <w:r>
+        <w:t xml:space="preserve">照片来源为 scikit-image v0.24.0 中的 NASA 公有领域宇航员图片，代码包的图片来源.txt 给出原始下载链接；不将照片或原板级代码声明为本次原创。</w:t>
+      </w:r>
+    </w:p>
+    <w:bookmarkEnd w:id="67"/>
+    <w:bookmarkStart w:id="68" w:name="附录-b-实践补充页"/>
     <w:p>
       <w:pPr>
         <w:pStyle w:val="Heading1"/>
@@ -1234,7 +1298,7 @@
         <w:ind w:firstLine="480"/>
       </w:pPr>
       <w:r>
-        <w:t xml:space="preserve">实际板卡型号：____________　目标编译版本：____________</w:t>
+        <w:t xml:space="preserve">实际板卡型号：ICETEK–VC5509-A（依据原实验记录）　目标编译版本：____________</w:t>
       </w:r>
     </w:p>
     <w:p>
@@ -1252,7 +1316,7 @@
         <w:ind w:firstLine="480"/>
       </w:pPr>
       <w:r>
-        <w:t xml:space="preserve">目标构建日志、内存检查：____________</w:t>
+        <w:t xml:space="preserve">新版目标构建日志、内存检查：____________</w:t>
       </w:r>
     </w:p>
     <w:p>
@@ -1282,8 +1346,8 @@
         <w:t xml:space="preserve">本人实际遇到的问题、解决过程与体会：____________</w:t>
       </w:r>
     </w:p>
-    <w:bookmarkEnd w:id="67"/>
     <w:bookmarkEnd w:id="68"/>
+    <w:bookmarkEnd w:id="69"/>
     <w:sectPr>
       <w:footerReference w:type="default" r:id="rId9"/>
       <w:pgSz w:w="11906" w:h="16838"/>

</xml_diff>